<commit_message>
Ajustes na cartela de 20/10 (2 min) após revisão; registra revogação do art. 771 do CC
Co-Authored-By: Claude Opus 5.5 <noreply@anthropic.com>
Claude-Session: https://claude.ai/code/session_01EGrxw11y1RieUGZ6R9XQan
</commit_message>
<xml_diff>
--- a/roteiros/curtos/ROTEIROS_20102026_2MIN.docx
+++ b/roteiros/curtos/ROTEIROS_20102026_2MIN.docx
@@ -224,6 +224,21 @@
           <w:sz w:val="15"/>
           <w:szCs w:val="15"/>
         </w:rPr>
+        <w:t xml:space="preserve">• Precedente para o bloco da lei (indicado pelo GPT): TSE, AI 28353, j. 23/4/2019 — quebra da rotina administrativa para concentrar atos de programa social às vésperas da eleição, com finalidade eleitoreira e gravidade, pode configurar abuso de poder político.</w:t>
+      </w:r>
+    </w:p>
+    <w:p>
+      <w:pPr>
+        <w:spacing w:after="0"/>
+      </w:pPr>
+      <w:r>
+        <w:rPr>
+          <w:rFonts w:ascii="Times New Roman" w:cs="Times New Roman" w:eastAsia="Times New Roman" w:hAnsi="Times New Roman"/>
+          <w:i/>
+          <w:iCs/>
+          <w:sz w:val="15"/>
+          <w:szCs w:val="15"/>
+        </w:rPr>
         <w:t xml:space="preserve">• Reajuste: Decreto 13.120/2026 (17/9/2026), 15,04% (INPC), piso de R$ 600 para R$ 691, efeitos a partir de 1/10 (Agência Brasil; CNN). Gilmar validou em 18/9/2026 no Mandado de Injunção 7.300 (DPU, 2020; arquivado em ago/2024; nova petição da DPU; Fachin enviou ao gabinete de Gilmar como último relator; o gabinete diz que é 'incorreto dizer que o ministro reabriu o processo' — por isso o texto diz 'num processo que estava arquivado desde 2024', fato descrito pelo Poder360). A decisão distingue 2022: 'ampliação temporária de benefícios, criação de novas prestações, antecipação do calendário de pagamentos' (Times Brasil, Conjur 18/9). Tirar print dessa passagem.</w:t>
       </w:r>
     </w:p>
@@ -420,7 +435,7 @@
           <w:sz w:val="24"/>
           <w:szCs w:val="24"/>
         </w:rPr>
-        <w:t xml:space="preserve">A Lei de Abuso de Autoridade diz, com todas as letras: divergência na interpretação da lei ou na avaliação das provas não é abuso. Juiz conduzir investigação de um jeito que outro juiz não gosta não é crime. E acusação de crime precisa de prova. Papel sem assinatura não é prova.</w:t>
+        <w:t xml:space="preserve">A Lei de Abuso de Autoridade diz, com todas as letras: divergência na interpretação da lei ou na avaliação das provas não é abuso. Juiz conduzir investigação de um jeito que outro juiz não gosta não é crime. E acusação de crime precisa de prova. E o próprio documento usado pra levantar a suspeita diz que não tem valor de prova.</w:t>
       </w:r>
     </w:p>
     <w:p>
@@ -1248,7 +1263,7 @@
           <w:sz w:val="24"/>
           <w:szCs w:val="24"/>
         </w:rPr>
-        <w:t xml:space="preserve">E o salário não pode cair. Quem ganha três mil por 44 horas continua ganhando três mil. E o que passar do novo limite vira hora extra, com pelo menos 50% a mais.</w:t>
+        <w:t xml:space="preserve">E o salário não pode cair. Quem ganha três mil por 44 horas continua ganhando três mil. E o que passar do novo limite, sem compensação válida, vira hora extra, com pelo menos 50% a mais.</w:t>
       </w:r>
     </w:p>
     <w:p>
@@ -1306,7 +1321,7 @@
           <w:sz w:val="24"/>
           <w:szCs w:val="24"/>
         </w:rPr>
-        <w:t xml:space="preserve">Empregado: até dezembro vale a regra atual, de 44 horas. Empresário: refaça a escala agora, ou vai acumular dívida trabalhista. O descanso é justo. A conta é que não pode cair só em quem gera emprego. Salva e manda pra quem trabalha na 6x1. Segue o Dr. Ryan!</w:t>
+        <w:t xml:space="preserve">Empregado: até dezembro vale a regra atual, de 44 horas. Empresário: refaça a escala agora, ou pode acumular dívida trabalhista. O descanso é justo. A conta é que não pode cair só em quem gera emprego. Salva e manda pra quem trabalha na 6x1. Segue o Dr. Ryan!</w:t>
       </w:r>
     </w:p>
     <w:p>
@@ -1800,7 +1815,7 @@
           <w:sz w:val="24"/>
           <w:szCs w:val="24"/>
         </w:rPr>
-        <w:t xml:space="preserve">RYAN: Vira hora extra, com pelo menos 50% a mais.</w:t>
+        <w:t xml:space="preserve">RYAN: Se não tiver compensação válida, vira hora extra, com pelo menos 50% a mais.</w:t>
       </w:r>
     </w:p>
     <w:p>
@@ -1856,7 +1871,7 @@
           <w:sz w:val="24"/>
           <w:szCs w:val="24"/>
         </w:rPr>
-        <w:t xml:space="preserve">RYAN: Refazer a escala agora. Quem deixar pra dezembro vai acumular dívida trabalhista. Salva e manda pra quem trabalha na 6x1. Segue o Dr. Ryan!</w:t>
+        <w:t xml:space="preserve">RYAN: Refazer a escala agora. Quem deixar pra dezembro pode acumular dívida trabalhista. Salva e manda pra quem trabalha na 6x1. Segue o Dr. Ryan!</w:t>
       </w:r>
     </w:p>
     <w:p>

</xml_diff>

<commit_message>
Cartela de 20/10 (2 min): fechamentos pela lei, sem 'na minha opinião'
Co-Authored-By: Claude Opus 5.5 <noreply@anthropic.com>
Claude-Session: https://claude.ai/code/session_01EGrxw11y1RieUGZ6R9XQan
</commit_message>
<xml_diff>
--- a/roteiros/curtos/ROTEIROS_20102026_2MIN.docx
+++ b/roteiros/curtos/ROTEIROS_20102026_2MIN.docx
@@ -178,21 +178,21 @@
           <w:sz w:val="24"/>
           <w:szCs w:val="24"/>
         </w:rPr>
-        <w:t xml:space="preserve">MINHA OPINIÃO</w:t>
-      </w:r>
-    </w:p>
-    <w:p>
-      <w:pPr>
-        <w:spacing w:after="80"/>
-        <w:jc w:val="both"/>
-      </w:pPr>
-      <w:r>
-        <w:rPr>
-          <w:rFonts w:ascii="Times New Roman" w:cs="Times New Roman" w:eastAsia="Times New Roman" w:hAnsi="Times New Roman"/>
-          <w:sz w:val="24"/>
-          <w:szCs w:val="24"/>
-        </w:rPr>
-        <w:t xml:space="preserve">Ninguém aqui é contra o Bolsa Família. O Flávio já disse que mantém. O problema é usar o calendário do benefício como calendário eleitoral. Pra mim, isso é abuso de poder e é crime eleitoral. E eu quero ver se a régua de 2022 vai valer em 2026. Segue o Dr. Ryan!</w:t>
+        <w:t xml:space="preserve">CONCLUSÃO</w:t>
+      </w:r>
+    </w:p>
+    <w:p>
+      <w:pPr>
+        <w:spacing w:after="80"/>
+        <w:jc w:val="both"/>
+      </w:pPr>
+      <w:r>
+        <w:rPr>
+          <w:rFonts w:ascii="Times New Roman" w:cs="Times New Roman" w:eastAsia="Times New Roman" w:hAnsi="Times New Roman"/>
+          <w:sz w:val="24"/>
+          <w:szCs w:val="24"/>
+        </w:rPr>
+        <w:t xml:space="preserve">Ninguém aqui é contra o Bolsa Família. O Flávio já disse que mantém. O problema é usar o calendário do benefício como calendário eleitoral. E a lei é clara: isso é o que o TSE chama de abuso de poder, e dar vantagem pra conseguir voto é crime. A lei está aí. Quem tem que se explicar é o governo, e quem tem que agir é o TSE. A régua de 2022 vai valer em 2026? Segue o Dr. Ryan!</w:t>
       </w:r>
     </w:p>
     <w:p>
@@ -269,7 +269,7 @@
           <w:sz w:val="15"/>
           <w:szCs w:val="15"/>
         </w:rPr>
-        <w:t xml:space="preserve">• Lei 9.504/1997, art. 73, § 10 (texto: 'No ano em que se realizar eleição, fica proibida a distribuição gratuita de bens, valores ou benefícios por parte da Administração Pública, exceto nos casos de calamidade pública, de estado de emergência ou de programas sociais autorizados em lei e já em execução orçamentária no exercício anterior...') e inciso IV (uso promocional). TSE (Temas Selecionados): ilícito o 'robusto incremento do programa no ano eleitoral, ainda que previsto em lei e com execução orçamentária prévia'; precedente de cassação por 'quebra da rotina administrativa' (número não confirmado). LC 64/1990, art. 22, XIV e XVI. CE, art. 299: o TSE exige dolo específico de obter voto e eleitor identificável. A frase 'pra mim, isso é abuso de poder e é crime eleitoral' é OPINIÃO do Ryan, por decisão dele (20/10): ele assume o risco. Não há decisão judicial reconhecendo ilicitude; o texto fala do ato, não afirma como fato que uma pessoa cometeu crime.</w:t>
+        <w:t xml:space="preserve">• Lei 9.504/1997, art. 73, § 10 (texto: 'No ano em que se realizar eleição, fica proibida a distribuição gratuita de bens, valores ou benefícios por parte da Administração Pública, exceto nos casos de calamidade pública, de estado de emergência ou de programas sociais autorizados em lei e já em execução orçamentária no exercício anterior...') e inciso IV (uso promocional). TSE (Temas Selecionados): ilícito o 'robusto incremento do programa no ano eleitoral, ainda que previsto em lei e com execução orçamentária prévia'; precedente de cassação por 'quebra da rotina administrativa' (número não confirmado). LC 64/1990, art. 22, XIV e XVI. CE, art. 299: o TSE exige dolo específico de obter voto e eleitor identificável. Enquadramento pedido pelo Ryan (20/10): 'a lei é clara; quem tem que se explicar é o governo'. O texto descreve a regra e o fato; não há decisão judicial reconhecendo ilicitude até 20/10.</w:t>
       </w:r>
     </w:p>
     <w:p>
@@ -479,21 +479,21 @@
           <w:sz w:val="24"/>
           <w:szCs w:val="24"/>
         </w:rPr>
-        <w:t xml:space="preserve">MINHA OPINIÃO</w:t>
-      </w:r>
-    </w:p>
-    <w:p>
-      <w:pPr>
-        <w:spacing w:after="80"/>
-        <w:jc w:val="both"/>
-      </w:pPr>
-      <w:r>
-        <w:rPr>
-          <w:rFonts w:ascii="Times New Roman" w:cs="Times New Roman" w:eastAsia="Times New Roman" w:hAnsi="Times New Roman"/>
-          <w:sz w:val="24"/>
-          <w:szCs w:val="24"/>
-        </w:rPr>
-        <w:t xml:space="preserve">Na minha opinião, é o retrato do Supremo hoje: quem aparece citado tentando colocar sob suspeita quem investiga. E o julgamento que decide se o Moraes pode ser investigado está parado desde setembro. Decidam logo, em público e com prova. Segue o Dr. Ryan!</w:t>
+        <w:t xml:space="preserve">CONCLUSÃO</w:t>
+      </w:r>
+    </w:p>
+    <w:p>
+      <w:pPr>
+        <w:spacing w:after="80"/>
+        <w:jc w:val="both"/>
+      </w:pPr>
+      <w:r>
+        <w:rPr>
+          <w:rFonts w:ascii="Times New Roman" w:cs="Times New Roman" w:eastAsia="Times New Roman" w:hAnsi="Times New Roman"/>
+          <w:sz w:val="24"/>
+          <w:szCs w:val="24"/>
+        </w:rPr>
+        <w:t xml:space="preserve">Esse é o retrato do Supremo hoje: quem aparece citado tentando colocar sob suspeita quem investiga. E o julgamento que decide se o Moraes pode ser investigado está parado desde setembro. Que decidam logo, em público e com prova. Segue o Dr. Ryan!</w:t>
       </w:r>
     </w:p>
     <w:p>
@@ -750,21 +750,21 @@
           <w:sz w:val="24"/>
           <w:szCs w:val="24"/>
         </w:rPr>
-        <w:t xml:space="preserve">MINHA OPINIÃO</w:t>
-      </w:r>
-    </w:p>
-    <w:p>
-      <w:pPr>
-        <w:spacing w:after="80"/>
-        <w:jc w:val="both"/>
-      </w:pPr>
-      <w:r>
-        <w:rPr>
-          <w:rFonts w:ascii="Times New Roman" w:cs="Times New Roman" w:eastAsia="Times New Roman" w:hAnsi="Times New Roman"/>
-          <w:sz w:val="24"/>
-          <w:szCs w:val="24"/>
-        </w:rPr>
-        <w:t xml:space="preserve">Na minha opinião, quem pode ser julgado não pode decidir as regras do próprio julgamento. Ninguém pode ser juiz em causa própria. E você, acha que o Senado de 2027 vai julgar? Segue o Dr. Ryan!</w:t>
+        <w:t xml:space="preserve">CONCLUSÃO</w:t>
+      </w:r>
+    </w:p>
+    <w:p>
+      <w:pPr>
+        <w:spacing w:after="80"/>
+        <w:jc w:val="both"/>
+      </w:pPr>
+      <w:r>
+        <w:rPr>
+          <w:rFonts w:ascii="Times New Roman" w:cs="Times New Roman" w:eastAsia="Times New Roman" w:hAnsi="Times New Roman"/>
+          <w:sz w:val="24"/>
+          <w:szCs w:val="24"/>
+        </w:rPr>
+        <w:t xml:space="preserve">É um princípio básico do Direito: ninguém pode ser juiz em causa própria. Quem pode ser julgado não decide as regras do próprio julgamento. A lei é do Congresso, e quem muda a lei é o Congresso. E você, acha que o Senado de 2027 vai julgar? Segue o Dr. Ryan!</w:t>
       </w:r>
     </w:p>
     <w:p>
@@ -1051,21 +1051,21 @@
           <w:sz w:val="24"/>
           <w:szCs w:val="24"/>
         </w:rPr>
-        <w:t xml:space="preserve">MINHA OPINIÃO</w:t>
-      </w:r>
-    </w:p>
-    <w:p>
-      <w:pPr>
-        <w:spacing w:after="80"/>
-        <w:jc w:val="both"/>
-      </w:pPr>
-      <w:r>
-        <w:rPr>
-          <w:rFonts w:ascii="Times New Roman" w:cs="Times New Roman" w:eastAsia="Times New Roman" w:hAnsi="Times New Roman"/>
-          <w:sz w:val="24"/>
-          <w:szCs w:val="24"/>
-        </w:rPr>
-        <w:t xml:space="preserve">O TSE precisa de uma régua só. Se é falso dizer que ele é contra, não pode usar a mesma ideia com outra roupa. Manda pra quem ainda acha que ele votou contra. Segue o Dr. Ryan!</w:t>
+        <w:t xml:space="preserve">CONCLUSÃO</w:t>
+      </w:r>
+    </w:p>
+    <w:p>
+      <w:pPr>
+        <w:spacing w:after="80"/>
+        <w:jc w:val="both"/>
+      </w:pPr>
+      <w:r>
+        <w:rPr>
+          <w:rFonts w:ascii="Times New Roman" w:cs="Times New Roman" w:eastAsia="Times New Roman" w:hAnsi="Times New Roman"/>
+          <w:sz w:val="24"/>
+          <w:szCs w:val="24"/>
+        </w:rPr>
+        <w:t xml:space="preserve">A lei é uma só, e o TSE precisa de uma régua só. Se é falso dizer que ele é contra, não pode usar a mesma ideia com outra roupa. Manda pra quem ainda acha que ele votou contra. Segue o Dr. Ryan!</w:t>
       </w:r>
     </w:p>
     <w:p>
@@ -1307,7 +1307,7 @@
           <w:sz w:val="24"/>
           <w:szCs w:val="24"/>
         </w:rPr>
-        <w:t xml:space="preserve">MINHA OPINIÃO</w:t>
+        <w:t xml:space="preserve">NA PRÁTICA</w:t>
       </w:r>
     </w:p>
     <w:p>
@@ -1578,7 +1578,7 @@
           <w:sz w:val="24"/>
           <w:szCs w:val="24"/>
         </w:rPr>
-        <w:t xml:space="preserve">MINHA OPINIÃO</w:t>
+        <w:t xml:space="preserve">NA PRÁTICA</w:t>
       </w:r>
     </w:p>
     <w:p>

</xml_diff>